<commit_message>
Multimedia U4: mapa mental más descriptivo y agregar Facilitador en portadas
Co-Authored-By: Claude Opus 4.8 <noreply@anthropic.com>
Claude-Session: https://claude.ai/code/session_01Mmrn7JLAhSVspHUWxCQFPE
</commit_message>
<xml_diff>
--- a/ANA/Multimedia Unidad IV/Ensayo_Clasificacion_Materiales_Multimedia.docx
+++ b/ANA/Multimedia Unidad IV/Ensayo_Clasificacion_Materiales_Multimedia.docx
@@ -345,6 +345,38 @@
           <w:sz w:val="24"/>
           <w:szCs w:val="24"/>
         </w:rPr>
+        <w:t xml:space="preserve">Facilitador:  </w:t>
+      </w:r>
+      <w:r>
+        <w:rPr>
+          <w:rFonts w:ascii="Times New Roman" w:cs="Times New Roman" w:eastAsia="Times New Roman" w:hAnsi="Times New Roman"/>
+          <w:b w:val="false"/>
+          <w:bCs w:val="false"/>
+          <w:i w:val="false"/>
+          <w:iCs w:val="false"/>
+          <w:color w:val="1E2A32"/>
+          <w:sz w:val="24"/>
+          <w:szCs w:val="24"/>
+        </w:rPr>
+        <w:t xml:space="preserve">Dr. Alejandro García Villalobos</w:t>
+      </w:r>
+    </w:p>
+    <w:p>
+      <w:pPr>
+        <w:spacing w:after="60"/>
+        <w:jc w:val="center"/>
+      </w:pPr>
+      <w:r>
+        <w:rPr>
+          <w:rFonts w:ascii="Times New Roman" w:cs="Times New Roman" w:eastAsia="Times New Roman" w:hAnsi="Times New Roman"/>
+          <w:b/>
+          <w:bCs/>
+          <w:i w:val="false"/>
+          <w:iCs w:val="false"/>
+          <w:color w:val="1E2A32"/>
+          <w:sz w:val="24"/>
+          <w:szCs w:val="24"/>
+        </w:rPr>
         <w:t xml:space="preserve">Alumna:  </w:t>
       </w:r>
       <w:r>

</xml_diff>